<commit_message>
Completed the API project implementing security
- Added the 412 and 409 validation tests for Products
- Corrected the TestInfrastructure to use Shared Cache for the SQLite InMemory Database
- Added security to the API Project (refer to README file in AUTH Project for complete steps)
</commit_message>
<xml_diff>
--- a/Notes/Angular/Creating the Angular Project.docx
+++ b/Notes/Angular/Creating the Angular Project.docx
@@ -205,6 +205,7 @@
         <w:t>Backend API (.NET 10 Web API)</w:t>
       </w:r>
     </w:p>
+    <w:p/>
     <w:p>
       <w:r>
         <w:t>Handles</w:t>
@@ -319,8 +320,13 @@
       <w:pPr>
         <w:pStyle w:val="code"/>
       </w:pPr>
-      <w:r>
-        <w:t>src/</w:t>
+      <w:proofErr w:type="spellStart"/>
+      <w:r>
+        <w:t>src</w:t>
+      </w:r>
+      <w:proofErr w:type="spellEnd"/>
+      <w:r>
+        <w:t>/</w:t>
       </w:r>
     </w:p>
     <w:p>
@@ -503,8 +509,13 @@
         <w:t>└──</w:t>
       </w:r>
       <w:r>
-        <w:t xml:space="preserve"> core.config.ts</w:t>
-      </w:r>
+        <w:t xml:space="preserve"> </w:t>
+      </w:r>
+      <w:proofErr w:type="spellStart"/>
+      <w:r>
+        <w:t>core.config.ts</w:t>
+      </w:r>
+      <w:proofErr w:type="spellEnd"/>
     </w:p>
     <w:p>
       <w:pPr>
@@ -692,8 +703,13 @@
         <w:t>└──</w:t>
       </w:r>
       <w:r>
-        <w:t xml:space="preserve"> shared.config.ts</w:t>
-      </w:r>
+        <w:t xml:space="preserve"> </w:t>
+      </w:r>
+      <w:proofErr w:type="spellStart"/>
+      <w:r>
+        <w:t>shared.config.ts</w:t>
+      </w:r>
+      <w:proofErr w:type="spellEnd"/>
     </w:p>
     <w:p>
       <w:pPr>
@@ -996,8 +1012,13 @@
         <w:t>└──</w:t>
       </w:r>
       <w:r>
-        <w:t xml:space="preserve"> routes.ts</w:t>
-      </w:r>
+        <w:t xml:space="preserve"> </w:t>
+      </w:r>
+      <w:proofErr w:type="spellStart"/>
+      <w:r>
+        <w:t>routes.ts</w:t>
+      </w:r>
+      <w:proofErr w:type="spellEnd"/>
     </w:p>
     <w:p>
       <w:pPr>
@@ -1283,8 +1304,13 @@
         <w:t>└──</w:t>
       </w:r>
       <w:r>
-        <w:t xml:space="preserve"> routes.ts</w:t>
-      </w:r>
+        <w:t xml:space="preserve"> </w:t>
+      </w:r>
+      <w:proofErr w:type="spellStart"/>
+      <w:r>
+        <w:t>routes.ts</w:t>
+      </w:r>
+      <w:proofErr w:type="spellEnd"/>
     </w:p>
     <w:p>
       <w:pPr>
@@ -1437,8 +1463,18 @@
         <w:t>└──</w:t>
       </w:r>
       <w:r>
-        <w:t xml:space="preserve"> layout.component.ts</w:t>
-      </w:r>
+        <w:t xml:space="preserve"> </w:t>
+      </w:r>
+      <w:proofErr w:type="spellStart"/>
+      <w:proofErr w:type="gramStart"/>
+      <w:r>
+        <w:t>layout.component</w:t>
+      </w:r>
+      <w:proofErr w:type="gramEnd"/>
+      <w:r>
+        <w:t>.ts</w:t>
+      </w:r>
+      <w:proofErr w:type="spellEnd"/>
     </w:p>
     <w:p>
       <w:pPr>
@@ -1486,8 +1522,18 @@
         <w:t>├──</w:t>
       </w:r>
       <w:r>
-        <w:t xml:space="preserve"> app.routes.ts</w:t>
-      </w:r>
+        <w:t xml:space="preserve"> </w:t>
+      </w:r>
+      <w:proofErr w:type="spellStart"/>
+      <w:proofErr w:type="gramStart"/>
+      <w:r>
+        <w:t>app.routes</w:t>
+      </w:r>
+      <w:proofErr w:type="gramEnd"/>
+      <w:r>
+        <w:t>.ts</w:t>
+      </w:r>
+      <w:proofErr w:type="spellEnd"/>
     </w:p>
     <w:p>
       <w:pPr>
@@ -1512,8 +1558,13 @@
         <w:t>└──</w:t>
       </w:r>
       <w:r>
-        <w:t xml:space="preserve"> main.ts</w:t>
-      </w:r>
+        <w:t xml:space="preserve"> </w:t>
+      </w:r>
+      <w:proofErr w:type="spellStart"/>
+      <w:r>
+        <w:t>main.ts</w:t>
+      </w:r>
+      <w:proofErr w:type="spellEnd"/>
     </w:p>
     <w:p>
       <w:pPr>
@@ -1569,8 +1620,13 @@
         <w:t>├──</w:t>
       </w:r>
       <w:r>
-        <w:t xml:space="preserve"> environment.ts</w:t>
-      </w:r>
+        <w:t xml:space="preserve"> </w:t>
+      </w:r>
+      <w:proofErr w:type="spellStart"/>
+      <w:r>
+        <w:t>environment.ts</w:t>
+      </w:r>
+      <w:proofErr w:type="spellEnd"/>
     </w:p>
     <w:p>
       <w:pPr>
@@ -1595,8 +1651,18 @@
         <w:t>└──</w:t>
       </w:r>
       <w:r>
-        <w:t xml:space="preserve"> environment.prod.ts</w:t>
-      </w:r>
+        <w:t xml:space="preserve"> </w:t>
+      </w:r>
+      <w:proofErr w:type="spellStart"/>
+      <w:proofErr w:type="gramStart"/>
+      <w:r>
+        <w:t>environment.prod</w:t>
+      </w:r>
+      <w:proofErr w:type="gramEnd"/>
+      <w:r>
+        <w:t>.ts</w:t>
+      </w:r>
+      <w:proofErr w:type="spellEnd"/>
     </w:p>
     <w:p>
       <w:r>
@@ -1752,7 +1818,23 @@
         </w:numPr>
       </w:pPr>
       <w:r>
-        <w:t>Shared models (ProblemDetails, PagedResult)</w:t>
+        <w:t>Shared models (</w:t>
+      </w:r>
+      <w:proofErr w:type="spellStart"/>
+      <w:r>
+        <w:t>ProblemDetails</w:t>
+      </w:r>
+      <w:proofErr w:type="spellEnd"/>
+      <w:r>
+        <w:t xml:space="preserve">, </w:t>
+      </w:r>
+      <w:proofErr w:type="spellStart"/>
+      <w:r>
+        <w:t>PagedResult</w:t>
+      </w:r>
+      <w:proofErr w:type="spellEnd"/>
+      <w:r>
+        <w:t>)</w:t>
       </w:r>
     </w:p>
     <w:p>
@@ -2038,12 +2120,21 @@
           <w:numId w:val="5"/>
         </w:numPr>
       </w:pPr>
-      <w:r>
-        <w:rPr>
-          <w:b/>
-          <w:bCs/>
-        </w:rPr>
-        <w:t>npm install -g</w:t>
+      <w:proofErr w:type="spellStart"/>
+      <w:r>
+        <w:rPr>
+          <w:b/>
+          <w:bCs/>
+        </w:rPr>
+        <w:t>npm</w:t>
+      </w:r>
+      <w:proofErr w:type="spellEnd"/>
+      <w:r>
+        <w:rPr>
+          <w:b/>
+          <w:bCs/>
+        </w:rPr>
+        <w:t xml:space="preserve"> install -g</w:t>
       </w:r>
       <w:r>
         <w:t xml:space="preserve"> @angular/cli</w:t>
@@ -2168,7 +2259,15 @@
         <w:t>ng new</w:t>
       </w:r>
       <w:r>
-        <w:t xml:space="preserve"> enterprise-ui </w:t>
+        <w:t xml:space="preserve"> enterprise-</w:t>
+      </w:r>
+      <w:proofErr w:type="spellStart"/>
+      <w:r>
+        <w:t>ui</w:t>
+      </w:r>
+      <w:proofErr w:type="spellEnd"/>
+      <w:r>
+        <w:t xml:space="preserve"> </w:t>
       </w:r>
       <w:r>
         <w:rPr>
@@ -2177,9 +2276,11 @@
         </w:rPr>
         <w:t>--standalone --routing --strict --style=</w:t>
       </w:r>
+      <w:proofErr w:type="spellStart"/>
       <w:r>
         <w:t>css</w:t>
       </w:r>
+      <w:proofErr w:type="spellEnd"/>
     </w:p>
     <w:p/>
     <w:p>
@@ -2308,7 +2409,23 @@
             <w:b/>
             <w:bCs/>
           </w:rPr>
-          <w:t>click here</w:t>
+          <w:t xml:space="preserve">click </w:t>
+        </w:r>
+        <w:r>
+          <w:rPr>
+            <w:rStyle w:val="Hyperlink"/>
+            <w:b/>
+            <w:bCs/>
+          </w:rPr>
+          <w:t>h</w:t>
+        </w:r>
+        <w:r>
+          <w:rPr>
+            <w:rStyle w:val="Hyperlink"/>
+            <w:b/>
+            <w:bCs/>
+          </w:rPr>
+          <w:t>ere</w:t>
         </w:r>
       </w:hyperlink>
       <w:r>
@@ -2399,8 +2516,17 @@
           <w:b/>
           <w:bCs/>
         </w:rPr>
-        <w:t>enterprise-ui</w:t>
-      </w:r>
+        <w:t>enterprise-</w:t>
+      </w:r>
+      <w:proofErr w:type="spellStart"/>
+      <w:r>
+        <w:rPr>
+          <w:b/>
+          <w:bCs/>
+        </w:rPr>
+        <w:t>ui</w:t>
+      </w:r>
+      <w:proofErr w:type="spellEnd"/>
       <w:r>
         <w:rPr>
           <w:b/>
@@ -2529,8 +2655,17 @@
           <w:b/>
           <w:bCs/>
         </w:rPr>
-        <w:t>--style=css</w:t>
-      </w:r>
+        <w:t>--style=</w:t>
+      </w:r>
+      <w:proofErr w:type="spellStart"/>
+      <w:r>
+        <w:rPr>
+          <w:b/>
+          <w:bCs/>
+        </w:rPr>
+        <w:t>css</w:t>
+      </w:r>
+      <w:proofErr w:type="spellEnd"/>
       <w:r>
         <w:tab/>
       </w:r>
@@ -2576,8 +2711,13 @@
         <w:t>cd</w:t>
       </w:r>
       <w:r>
-        <w:t xml:space="preserve"> enterprise-ui</w:t>
-      </w:r>
+        <w:t xml:space="preserve"> enterprise-</w:t>
+      </w:r>
+      <w:proofErr w:type="spellStart"/>
+      <w:r>
+        <w:t>ui</w:t>
+      </w:r>
+      <w:proofErr w:type="spellEnd"/>
     </w:p>
     <w:p>
       <w:pPr>
@@ -2645,8 +2785,17 @@
           <w:b/>
           <w:bCs/>
         </w:rPr>
-        <w:t>ng serve</w:t>
-      </w:r>
+        <w:t xml:space="preserve">ng </w:t>
+      </w:r>
+      <w:proofErr w:type="gramStart"/>
+      <w:r>
+        <w:rPr>
+          <w:b/>
+          <w:bCs/>
+        </w:rPr>
+        <w:t>serve</w:t>
+      </w:r>
+      <w:proofErr w:type="gramEnd"/>
     </w:p>
     <w:p>
       <w:pPr>
@@ -2892,8 +3041,17 @@
           <w:b/>
           <w:bCs/>
         </w:rPr>
-        <w:t>git remote -v</w:t>
-      </w:r>
+        <w:t xml:space="preserve">git </w:t>
+      </w:r>
+      <w:proofErr w:type="gramStart"/>
+      <w:r>
+        <w:rPr>
+          <w:b/>
+          <w:bCs/>
+        </w:rPr>
+        <w:t>remote -v</w:t>
+      </w:r>
+      <w:proofErr w:type="gramEnd"/>
       <w:r>
         <w:tab/>
       </w:r>
@@ -2936,11 +3094,16 @@
     </w:p>
     <w:p/>
     <w:p>
+      <w:proofErr w:type="gramStart"/>
       <w:r>
         <w:t>Or</w:t>
       </w:r>
       <w:r>
-        <w:t>, using Command Line</w:t>
+        <w:t>,</w:t>
+      </w:r>
+      <w:proofErr w:type="gramEnd"/>
+      <w:r>
+        <w:t xml:space="preserve"> using Command Line</w:t>
       </w:r>
       <w:r>
         <w:t>:</w:t>
@@ -3002,8 +3165,13 @@
         <w:pStyle w:val="ListParagraph"/>
       </w:pPr>
       <w:r>
-        <w:t>Name: enterprise-ui</w:t>
-      </w:r>
+        <w:t>Name: enterprise-</w:t>
+      </w:r>
+      <w:proofErr w:type="spellStart"/>
+      <w:r>
+        <w:t>ui</w:t>
+      </w:r>
+      <w:proofErr w:type="spellEnd"/>
     </w:p>
     <w:p>
       <w:pPr>
@@ -3038,8 +3206,18 @@
         <w:t>❗</w:t>
       </w:r>
       <w:r>
-        <w:t xml:space="preserve"> DO NOT add .gitignore</w:t>
-      </w:r>
+        <w:t xml:space="preserve"> DO NOT </w:t>
+      </w:r>
+      <w:proofErr w:type="gramStart"/>
+      <w:r>
+        <w:t>add .</w:t>
+      </w:r>
+      <w:proofErr w:type="spellStart"/>
+      <w:r>
+        <w:t>gitignore</w:t>
+      </w:r>
+      <w:proofErr w:type="spellEnd"/>
+      <w:proofErr w:type="gramEnd"/>
     </w:p>
     <w:p>
       <w:pPr>
@@ -3125,8 +3303,17 @@
           <w:b/>
           <w:bCs/>
         </w:rPr>
-        <w:t>git remote -v</w:t>
-      </w:r>
+        <w:t xml:space="preserve">git </w:t>
+      </w:r>
+      <w:proofErr w:type="gramStart"/>
+      <w:r>
+        <w:rPr>
+          <w:b/>
+          <w:bCs/>
+        </w:rPr>
+        <w:t>remote -v</w:t>
+      </w:r>
+      <w:proofErr w:type="gramEnd"/>
     </w:p>
     <w:p>
       <w:pPr>
@@ -3465,13 +3652,50 @@
           <w:sz w:val="22"/>
           <w:szCs w:val="22"/>
         </w:rPr>
-        <w:t>ng new enterprise-ui --standalone --routing --strict --style=css --skip-git</w:t>
+        <w:t>ng new enterprise-</w:t>
+      </w:r>
+      <w:proofErr w:type="spellStart"/>
+      <w:r>
+        <w:rPr>
+          <w:sz w:val="22"/>
+          <w:szCs w:val="22"/>
+        </w:rPr>
+        <w:t>ui</w:t>
+      </w:r>
+      <w:proofErr w:type="spellEnd"/>
+      <w:r>
+        <w:rPr>
+          <w:sz w:val="22"/>
+          <w:szCs w:val="22"/>
+        </w:rPr>
+        <w:t xml:space="preserve"> --standalone --routing --strict --style=</w:t>
+      </w:r>
+      <w:proofErr w:type="spellStart"/>
+      <w:r>
+        <w:rPr>
+          <w:sz w:val="22"/>
+          <w:szCs w:val="22"/>
+        </w:rPr>
+        <w:t>css</w:t>
+      </w:r>
+      <w:proofErr w:type="spellEnd"/>
+      <w:r>
+        <w:rPr>
+          <w:sz w:val="22"/>
+          <w:szCs w:val="22"/>
+        </w:rPr>
+        <w:t xml:space="preserve"> --skip-git</w:t>
       </w:r>
     </w:p>
     <w:p/>
     <w:p>
-      <w:r>
-        <w:t xml:space="preserve">And, then, </w:t>
+      <w:proofErr w:type="gramStart"/>
+      <w:r>
+        <w:t>And,</w:t>
+      </w:r>
+      <w:proofErr w:type="gramEnd"/>
+      <w:r>
+        <w:t xml:space="preserve"> then, </w:t>
       </w:r>
       <w:r>
         <w:t>configure GitHub</w:t>
@@ -3492,8 +3716,13 @@
         </w:numPr>
       </w:pPr>
       <w:r>
-        <w:t>git init</w:t>
-      </w:r>
+        <w:t xml:space="preserve">git </w:t>
+      </w:r>
+      <w:proofErr w:type="spellStart"/>
+      <w:r>
+        <w:t>init</w:t>
+      </w:r>
+      <w:proofErr w:type="spellEnd"/>
     </w:p>
     <w:p>
       <w:pPr>
@@ -3510,7 +3739,15 @@
         </w:numPr>
       </w:pPr>
       <w:r>
-        <w:t>git remote add origin &lt;github-url&gt;</w:t>
+        <w:t>git remote add origin &lt;</w:t>
+      </w:r>
+      <w:proofErr w:type="spellStart"/>
+      <w:r>
+        <w:t>github-url</w:t>
+      </w:r>
+      <w:proofErr w:type="spellEnd"/>
+      <w:r>
+        <w:t>&gt;</w:t>
       </w:r>
     </w:p>
     <w:p>
@@ -3528,8 +3765,13 @@
         </w:numPr>
       </w:pPr>
       <w:r>
-        <w:t>git add .</w:t>
-      </w:r>
+        <w:t xml:space="preserve">git </w:t>
+      </w:r>
+      <w:proofErr w:type="gramStart"/>
+      <w:r>
+        <w:t>add .</w:t>
+      </w:r>
+      <w:proofErr w:type="gramEnd"/>
       <w:r>
         <w:br/>
       </w:r>
@@ -3615,6 +3857,7 @@
       <w:r>
         <w:t xml:space="preserve">This is configured in the </w:t>
       </w:r>
+      <w:proofErr w:type="spellStart"/>
       <w:r>
         <w:rPr>
           <w:b/>
@@ -3622,6 +3865,7 @@
         </w:rPr>
         <w:t>angular.json</w:t>
       </w:r>
+      <w:proofErr w:type="spellEnd"/>
       <w:r>
         <w:t xml:space="preserve"> file, under:</w:t>
       </w:r>
@@ -3640,7 +3884,23 @@
           <w:sz w:val="22"/>
           <w:szCs w:val="22"/>
         </w:rPr>
-        <w:t>projects → WebApiWithAngular-UI → architect → build → configurations → production</w:t>
+        <w:t xml:space="preserve">projects → </w:t>
+      </w:r>
+      <w:proofErr w:type="spellStart"/>
+      <w:r>
+        <w:rPr>
+          <w:sz w:val="22"/>
+          <w:szCs w:val="22"/>
+        </w:rPr>
+        <w:t>WebApiWithAngular</w:t>
+      </w:r>
+      <w:proofErr w:type="spellEnd"/>
+      <w:r>
+        <w:rPr>
+          <w:sz w:val="22"/>
+          <w:szCs w:val="22"/>
+        </w:rPr>
+        <w:t>-UI → architect → build → configurations → production</w:t>
       </w:r>
     </w:p>
     <w:p>
@@ -3692,7 +3952,15 @@
         <w:pStyle w:val="code"/>
       </w:pPr>
       <w:r>
-        <w:t xml:space="preserve">  "maximumWarning": "</w:t>
+        <w:t xml:space="preserve">  "</w:t>
+      </w:r>
+      <w:proofErr w:type="spellStart"/>
+      <w:r>
+        <w:t>maximumWarning</w:t>
+      </w:r>
+      <w:proofErr w:type="spellEnd"/>
+      <w:r>
+        <w:t>": "</w:t>
       </w:r>
       <w:r>
         <w:rPr>
@@ -3710,7 +3978,15 @@
         <w:pStyle w:val="code"/>
       </w:pPr>
       <w:r>
-        <w:t xml:space="preserve">  "maximumError": "1MB"</w:t>
+        <w:t xml:space="preserve">  "</w:t>
+      </w:r>
+      <w:proofErr w:type="spellStart"/>
+      <w:r>
+        <w:t>maximumError</w:t>
+      </w:r>
+      <w:proofErr w:type="spellEnd"/>
+      <w:r>
+        <w:t>": "1MB"</w:t>
       </w:r>
     </w:p>
     <w:p>
@@ -3780,8 +4056,21 @@
         <w:pStyle w:val="code"/>
       </w:pPr>
       <w:r>
-        <w:t>ng new enterprise-ui --standalone --routing --strict --style=css</w:t>
-      </w:r>
+        <w:t>ng new enterprise-</w:t>
+      </w:r>
+      <w:proofErr w:type="spellStart"/>
+      <w:r>
+        <w:t>ui</w:t>
+      </w:r>
+      <w:proofErr w:type="spellEnd"/>
+      <w:r>
+        <w:t xml:space="preserve"> --standalone --routing --strict --style=</w:t>
+      </w:r>
+      <w:proofErr w:type="spellStart"/>
+      <w:r>
+        <w:t>css</w:t>
+      </w:r>
+      <w:proofErr w:type="spellEnd"/>
     </w:p>
     <w:p/>
     <w:p>
@@ -3853,7 +4142,15 @@
     </w:p>
     <w:p>
       <w:r>
-        <w:t>Historically, Angular relied on a library called zone.js to automatically detect when asynchronous events happen (like button clicks, HTTP requests, or setTimeout). When these events occur</w:t>
+        <w:t>Historically, Angular relied on a library called zone.js to automatically detect when asynchronous events happen (like button clicks, HTTP requests, or </w:t>
+      </w:r>
+      <w:proofErr w:type="spellStart"/>
+      <w:r>
+        <w:t>setTimeout</w:t>
+      </w:r>
+      <w:proofErr w:type="spellEnd"/>
+      <w:r>
+        <w:t>). When these events occur</w:t>
       </w:r>
       <w:r>
         <w:t xml:space="preserve"> </w:t>
@@ -3951,7 +4248,15 @@
         <w:t>Manual Detection:</w:t>
       </w:r>
       <w:r>
-        <w:t> Explicitly calling ChangeDetectorRef.markForCheck(). </w:t>
+        <w:t> Explicitly calling </w:t>
+      </w:r>
+      <w:proofErr w:type="spellStart"/>
+      <w:r>
+        <w:t>ChangeDetectorRef.markForCheck</w:t>
+      </w:r>
+      <w:proofErr w:type="spellEnd"/>
+      <w:r>
+        <w:t>(). </w:t>
       </w:r>
     </w:p>
     <w:p>
@@ -4093,7 +4398,28 @@
         </w:numPr>
       </w:pPr>
       <w:r>
-        <w:t>Configure the application to use provideZonelessChangeDetection() in your app.config.ts (instead of the default zone-based provider).</w:t>
+        <w:t>Configure the application to use </w:t>
+      </w:r>
+      <w:proofErr w:type="spellStart"/>
+      <w:proofErr w:type="gramStart"/>
+      <w:r>
+        <w:t>provideZonelessChangeDetection</w:t>
+      </w:r>
+      <w:proofErr w:type="spellEnd"/>
+      <w:r>
+        <w:t>(</w:t>
+      </w:r>
+      <w:proofErr w:type="gramEnd"/>
+      <w:r>
+        <w:t>) in your </w:t>
+      </w:r>
+      <w:proofErr w:type="spellStart"/>
+      <w:r>
+        <w:t>app.config.ts</w:t>
+      </w:r>
+      <w:proofErr w:type="spellEnd"/>
+      <w:r>
+        <w:t> (instead of the default zone-based provider).</w:t>
       </w:r>
     </w:p>
     <w:p>
@@ -4104,7 +4430,25 @@
         </w:numPr>
       </w:pPr>
       <w:r>
-        <w:t>Remove zone.js from the polyfills array in your angular.json. </w:t>
+        <w:t>Remove zone.js from the </w:t>
+      </w:r>
+      <w:proofErr w:type="spellStart"/>
+      <w:r>
+        <w:t>polyfills</w:t>
+      </w:r>
+      <w:proofErr w:type="spellEnd"/>
+      <w:r>
+        <w:t> array in your </w:t>
+      </w:r>
+      <w:proofErr w:type="spellStart"/>
+      <w:proofErr w:type="gramStart"/>
+      <w:r>
+        <w:t>angular.json</w:t>
+      </w:r>
+      <w:proofErr w:type="spellEnd"/>
+      <w:proofErr w:type="gramEnd"/>
+      <w:r>
+        <w:t>. </w:t>
       </w:r>
     </w:p>
     <w:p>

</xml_diff>